<commit_message>
CaF2 vs Ag/SiNW figures (Fig 1a, 1b): larger fonts and lines for print
Co-Authored-By: Claude Opus 5.5 <noreply@anthropic.com>
Claude-Session: https://claude.ai/code/session_01L8hQ8e5u5KmaH4dD9snyRw
</commit_message>
<xml_diff>
--- a/Acacia_Paper_All_Code.docx
+++ b/Acacia_Paper_All_Code.docx
@@ -3769,6 +3769,19 @@
           <w:sz w:val="15"/>
           <w:noProof/>
         </w:rPr>
+        <w:t xml:space="preserve">    fs_peak, fs_name, fs_axis, fs_tick = 12, 15, 17, 15     # readable at one-column width</w:t>
+      </w:r>
+    </w:p>
+    <w:p>
+      <w:pPr>
+        <w:spacing w:before="0" w:after="0" w:line="240" w:lineRule="auto"/>
+      </w:pPr>
+      <w:r>
+        <w:rPr>
+          <w:rFonts w:ascii="Consolas" w:hAnsi="Consolas" w:eastAsia="Consolas" w:cs="Consolas"/>
+          <w:sz w:val="15"/>
+          <w:noProof/>
+        </w:rPr>
         <w:t xml:space="preserve">    fig, (axL, axR) = plt.subplots(1, 2, sharey=True, figsize=(9, 6.5),</w:t>
       </w:r>
     </w:p>
@@ -3884,7 +3897,7 @@
           <w:sz w:val="15"/>
           <w:noProof/>
         </w:rPr>
-        <w:t xml:space="preserve">    y_top = y_max + 0.45 * (y_max - y_min)</w:t>
+        <w:t xml:space="preserve">    y_top = y_max + 0.70 * (y_max - y_min)</w:t>
       </w:r>
     </w:p>
     <w:p>
@@ -3949,7 +3962,7 @@
           <w:sz w:val="15"/>
           <w:noProof/>
         </w:rPr>
-        <w:t xml:space="preserve">            ax.plot(d[m, 0], d[m, 1], color=col, lw=0.6)</w:t>
+        <w:t xml:space="preserve">            ax.plot(d[m, 0], d[m, 1], color=col, lw=0.8)</w:t>
       </w:r>
     </w:p>
     <w:p>
@@ -4027,7 +4040,7 @@
           <w:sz w:val="15"/>
           <w:noProof/>
         </w:rPr>
-        <w:t xml:space="preserve">            near_left = k &gt; 0 and measured - pos[k - 1] &lt; 35</w:t>
+        <w:t xml:space="preserve">            near_left = k &gt; 0 and measured - pos[k - 1] &lt; 45</w:t>
       </w:r>
     </w:p>
     <w:p>
@@ -4066,7 +4079,7 @@
           <w:sz w:val="15"/>
           <w:noProof/>
         </w:rPr>
-        <w:t xml:space="preserve">                        ha=ha, va='top', fontsize=7.5, color=SINGLE_COL[cls])</w:t>
+        <w:t xml:space="preserve">                        ha=ha, va='top', fontsize=fs_peak, color=SINGLE_COL[cls])</w:t>
       </w:r>
     </w:p>
     <w:p>
@@ -4131,20 +4144,20 @@
           <w:sz w:val="15"/>
           <w:noProof/>
         </w:rPr>
-        <w:t xml:space="preserve">                    color='k', ls=':', lw=0.8)</w:t>
-      </w:r>
-    </w:p>
-    <w:p>
-      <w:pPr>
-        <w:spacing w:before="0" w:after="0" w:line="240" w:lineRule="auto"/>
-      </w:pPr>
-      <w:r>
-        <w:rPr>
-          <w:rFonts w:ascii="Consolas" w:hAnsi="Consolas" w:eastAsia="Consolas" w:cs="Consolas"/>
-          <w:sz w:val="15"/>
-          <w:noProof/>
-        </w:rPr>
-        <w:t xml:space="preserve">        ax.tick_params(direction='in', top=True)</w:t>
+        <w:t xml:space="preserve">                    color='k', ls=':', lw=1.0)</w:t>
+      </w:r>
+    </w:p>
+    <w:p>
+      <w:pPr>
+        <w:spacing w:before="0" w:after="0" w:line="240" w:lineRule="auto"/>
+      </w:pPr>
+      <w:r>
+        <w:rPr>
+          <w:rFonts w:ascii="Consolas" w:hAnsi="Consolas" w:eastAsia="Consolas" w:cs="Consolas"/>
+          <w:sz w:val="15"/>
+          <w:noProof/>
+        </w:rPr>
+        <w:t xml:space="preserve">        ax.tick_params(direction='in', top=True, length=6, width=1.0, labelsize=fs_tick)</w:t>
       </w:r>
     </w:p>
     <w:p>
@@ -4274,7 +4287,7 @@
           <w:sz w:val="15"/>
           <w:noProof/>
         </w:rPr>
-        <w:t xml:space="preserve">        axL.text(420, d_[m, 1].min() - 0.015 * (y_top - y_min), txt, color=col, fontsize=10,</w:t>
+        <w:t xml:space="preserve">        axL.text(420, d_[m, 1].min() - 0.015 * (y_top - y_min), txt, color=col, fontsize=fs_name,</w:t>
       </w:r>
     </w:p>
     <w:p>
@@ -4365,46 +4378,46 @@
           <w:sz w:val="15"/>
           <w:noProof/>
         </w:rPr>
-        <w:t xml:space="preserve">                    color='k', clip_on=False, lw=0.8)</w:t>
-      </w:r>
-    </w:p>
-    <w:p>
-      <w:pPr>
-        <w:spacing w:before="0" w:after="0" w:line="240" w:lineRule="auto"/>
-      </w:pPr>
-      <w:r>
-        <w:rPr>
-          <w:rFonts w:ascii="Consolas" w:hAnsi="Consolas" w:eastAsia="Consolas" w:cs="Consolas"/>
-          <w:sz w:val="15"/>
-          <w:noProof/>
-        </w:rPr>
-        <w:t xml:space="preserve">    axL.set_ylabel('Raman Intensity (a.u.)', fontsize=11)</w:t>
-      </w:r>
-    </w:p>
-    <w:p>
-      <w:pPr>
-        <w:spacing w:before="0" w:after="0" w:line="240" w:lineRule="auto"/>
-      </w:pPr>
-      <w:r>
-        <w:rPr>
-          <w:rFonts w:ascii="Consolas" w:hAnsi="Consolas" w:eastAsia="Consolas" w:cs="Consolas"/>
-          <w:sz w:val="15"/>
-          <w:noProof/>
-        </w:rPr>
-        <w:t xml:space="preserve">    fig.text(0.5, 0.02, 'Wavenumber (cm$^{-1}$)', ha='center', fontsize=11)</w:t>
-      </w:r>
-    </w:p>
-    <w:p>
-      <w:pPr>
-        <w:spacing w:before="0" w:after="0" w:line="240" w:lineRule="auto"/>
-      </w:pPr>
-      <w:r>
-        <w:rPr>
-          <w:rFonts w:ascii="Consolas" w:hAnsi="Consolas" w:eastAsia="Consolas" w:cs="Consolas"/>
-          <w:sz w:val="15"/>
-          <w:noProof/>
-        </w:rPr>
-        <w:t xml:space="preserve">    fig.subplots_adjust(left=0.06, right=0.97, bottom=0.10, top=0.97)</w:t>
+        <w:t xml:space="preserve">                    color='k', clip_on=False, lw=1.0)</w:t>
+      </w:r>
+    </w:p>
+    <w:p>
+      <w:pPr>
+        <w:spacing w:before="0" w:after="0" w:line="240" w:lineRule="auto"/>
+      </w:pPr>
+      <w:r>
+        <w:rPr>
+          <w:rFonts w:ascii="Consolas" w:hAnsi="Consolas" w:eastAsia="Consolas" w:cs="Consolas"/>
+          <w:sz w:val="15"/>
+          <w:noProof/>
+        </w:rPr>
+        <w:t xml:space="preserve">    axL.set_ylabel('Raman Intensity (a.u.)', fontsize=fs_axis)</w:t>
+      </w:r>
+    </w:p>
+    <w:p>
+      <w:pPr>
+        <w:spacing w:before="0" w:after="0" w:line="240" w:lineRule="auto"/>
+      </w:pPr>
+      <w:r>
+        <w:rPr>
+          <w:rFonts w:ascii="Consolas" w:hAnsi="Consolas" w:eastAsia="Consolas" w:cs="Consolas"/>
+          <w:sz w:val="15"/>
+          <w:noProof/>
+        </w:rPr>
+        <w:t xml:space="preserve">    fig.text(0.53, 0.015, 'Wavenumber (cm$^{-1}$)', ha='center', fontsize=fs_axis)</w:t>
+      </w:r>
+    </w:p>
+    <w:p>
+      <w:pPr>
+        <w:spacing w:before="0" w:after="0" w:line="240" w:lineRule="auto"/>
+      </w:pPr>
+      <w:r>
+        <w:rPr>
+          <w:rFonts w:ascii="Consolas" w:hAnsi="Consolas" w:eastAsia="Consolas" w:cs="Consolas"/>
+          <w:sz w:val="15"/>
+          <w:noProof/>
+        </w:rPr>
+        <w:t xml:space="preserve">    fig.subplots_adjust(left=0.07, right=0.97, bottom=0.12, top=0.97)</w:t>
       </w:r>
     </w:p>
     <w:p>

</xml_diff>

<commit_message>
Find raw single-spectrum files by their real Windows names (spaces, %, with or without .txt)
Co-Authored-By: Claude Opus 5.5 <noreply@anthropic.com>
Claude-Session: https://claude.ai/code/session_01L8hQ8e5u5KmaH4dD9snyRw
</commit_message>
<xml_diff>
--- a/Acacia_Paper_All_Code.docx
+++ b/Acacia_Paper_All_Code.docx
@@ -7,7 +7,7 @@
         <w:pStyle w:val="Heading1"/>
       </w:pPr>
       <w:r>
-        <w:t>Acacia EVs vs NVs - ALL paper figures, tables and model details (Acacia_Paper_All.py)</w:t>
+        <w:t>Acacia EVs vs NVs - CaF2 vs Ag/SiNWs - SERS enhancement figure (EV and NV)</w:t>
       </w:r>
     </w:p>
     <w:p>
@@ -23,7 +23,7 @@
         <w:spacing w:after="40"/>
       </w:pPr>
       <w:r>
-        <w:t>1. In PyCharm: File &gt; New &gt; Python File, name it Acacia_Paper_All.py.</w:t>
+        <w:t>1. In PyCharm: File &gt; New &gt; Python File, name it CaF2_vs_AgSiNW_Enhancement.py.</w:t>
       </w:r>
     </w:p>
     <w:p>
@@ -39,7 +39,7 @@
         <w:spacing w:after="40"/>
       </w:pPr>
       <w:r>
-        <w:t>3. In the PyCharm Terminal, install the packages once:  pip install numpy scipy pandas openpyxl matplotlib scikit-learn</w:t>
+        <w:t>3. In the PyCharm Terminal, install the packages once:  pip install numpy scipy matplotlib</w:t>
       </w:r>
     </w:p>
     <w:p>
@@ -47,7 +47,7 @@
         <w:spacing w:after="40"/>
       </w:pPr>
       <w:r>
-        <w:t>4. For Figure 1, make a folder "Single spectra" inside CODE 005 and copy the 4 single-spectrum .txt files into it (CaF2 and Ag/SiNW, EV and NV; names are listed at the top of the code). Without it, Figure 1 is skipped.</w:t>
+        <w:t>4. Put the four raw .txt files (EV and NV, on CaF2 and on Ag/SiNWs, original names) in C:\Users\Hira Aman\Downloads\comparison ev nv.</w:t>
       </w:r>
     </w:p>
     <w:p>
@@ -55,7 +55,7 @@
         <w:spacing w:after="40"/>
       </w:pPr>
       <w:r>
-        <w:t>5. Run the file (a few minutes). All figures (PNG + TIFF, 600 dpi), Table 1, Tables S1-S5, Model_details.txt and RESULTS_for_manuscript.txt are saved in C:\Users\Hira Aman\Downloads\CODE 005\PAPER.</w:t>
+        <w:t>5. Run the file. The band table (signal/noise on Ag/SiNWs and on CaF2) is printed; CaF2_vs_AgSiNW_Enhancement (two panels) and CaF2_vs_AgSiNW_OneGraph (all four spectra in one graph), PNG + TIFF at 600 dpi, and CaF2_vs_AgSiNW_bands.csv are saved in the same folder.</w:t>
       </w:r>
     </w:p>
     <w:p>
@@ -3472,7 +3472,33 @@
           <w:sz w:val="15"/>
           <w:noProof/>
         </w:rPr>
-        <w:t xml:space="preserve">    hits = [f for f in SINGLE_DIR.glob('*.txt') if f.name.lower().startswith(prefix)]</w:t>
+        <w:t xml:space="preserve">    simple = lambda n: n.lower().replace(' ', '_').replace('%', '')   # 'S2-EV Acacia ... 10%' -&gt; 's2-ev_acacia ... 10'</w:t>
+      </w:r>
+    </w:p>
+    <w:p>
+      <w:pPr>
+        <w:spacing w:before="0" w:after="0" w:line="240" w:lineRule="auto"/>
+      </w:pPr>
+      <w:r>
+        <w:rPr>
+          <w:rFonts w:ascii="Consolas" w:hAnsi="Consolas" w:eastAsia="Consolas" w:cs="Consolas"/>
+          <w:sz w:val="15"/>
+          <w:noProof/>
+        </w:rPr>
+        <w:t xml:space="preserve">    hits = [f for f in SINGLE_DIR.iterdir() if f.is_file() and f.suffix.lower() in ('.txt', '')</w:t>
+      </w:r>
+    </w:p>
+    <w:p>
+      <w:pPr>
+        <w:spacing w:before="0" w:after="0" w:line="240" w:lineRule="auto"/>
+      </w:pPr>
+      <w:r>
+        <w:rPr>
+          <w:rFonts w:ascii="Consolas" w:hAnsi="Consolas" w:eastAsia="Consolas" w:cs="Consolas"/>
+          <w:sz w:val="15"/>
+          <w:noProof/>
+        </w:rPr>
+        <w:t xml:space="preserve">            and simple(f.name).startswith(prefix)]</w:t>
       </w:r>
     </w:p>
     <w:p>

</xml_diff>

<commit_message>
PCA-LDA validated with PCA fitted on the training folds only (Fig 5, Table 1, Table S2, permutation test); consistent with Fig 3 b/d
Co-Authored-By: Claude Opus 5.5 <noreply@anthropic.com>
Claude-Session: https://claude.ai/code/session_01L8hQ8e5u5KmaH4dD9snyRw
</commit_message>
<xml_diff>
--- a/Acacia_Paper_All_Code.docx
+++ b/Acacia_Paper_All_Code.docx
@@ -1265,6 +1265,32 @@
           <w:sz w:val="15"/>
           <w:noProof/>
         </w:rPr>
+        <w:t>PCA_PER_FOLD = True                         # PCA-LDA: True = PCA fitted on the training folds only</w:t>
+      </w:r>
+    </w:p>
+    <w:p>
+      <w:pPr>
+        <w:spacing w:before="0" w:after="0" w:line="240" w:lineRule="auto"/>
+      </w:pPr>
+      <w:r>
+        <w:rPr>
+          <w:rFonts w:ascii="Consolas" w:hAnsi="Consolas" w:eastAsia="Consolas" w:cs="Consolas"/>
+          <w:sz w:val="15"/>
+          <w:noProof/>
+        </w:rPr>
+        <w:t xml:space="preserve">                                            # (main result); False = PCA once on all 240 spectra</w:t>
+      </w:r>
+    </w:p>
+    <w:p>
+      <w:pPr>
+        <w:spacing w:before="0" w:after="0" w:line="240" w:lineRule="auto"/>
+      </w:pPr>
+      <w:r>
+        <w:rPr>
+          <w:rFonts w:ascii="Consolas" w:hAnsi="Consolas" w:eastAsia="Consolas" w:cs="Consolas"/>
+          <w:sz w:val="15"/>
+          <w:noProof/>
+        </w:rPr>
         <w:t>N_PERM_MODE = 'exact'                       # 'exact' = all 924 site labelings, 'skip'</w:t>
       </w:r>
     </w:p>
@@ -16701,7 +16727,20 @@
           <w:sz w:val="15"/>
           <w:noProof/>
         </w:rPr>
-        <w:t>#   PCA-LDA: PCA (5 PCs) on all spectra without labels; LDA on the training folds</w:t>
+        <w:t>#   PCA-LDA: PCA (5 PCs) + LDA fitted on the training folds (PCA_PER_FOLD = True;</w:t>
+      </w:r>
+    </w:p>
+    <w:p>
+      <w:pPr>
+        <w:spacing w:before="0" w:after="0" w:line="240" w:lineRule="auto"/>
+      </w:pPr>
+      <w:r>
+        <w:rPr>
+          <w:rFonts w:ascii="Consolas" w:hAnsi="Consolas" w:eastAsia="Consolas" w:cs="Consolas"/>
+          <w:sz w:val="15"/>
+          <w:noProof/>
+        </w:rPr>
+        <w:t>#            False: PCA once on all spectra without labels, LDA on the training folds)</w:t>
       </w:r>
     </w:p>
     <w:p>
@@ -17098,7 +17137,33 @@
           <w:sz w:val="15"/>
           <w:noProof/>
         </w:rPr>
-        <w:t>report('\n6. FIGURE 5 - cross-validation')</w:t>
+        <w:t>MAIN_TXT = 'PCA fitted on the training folds only' if PCA_PER_FOLD else 'PCA fitted once on all spectra'</w:t>
+      </w:r>
+    </w:p>
+    <w:p>
+      <w:pPr>
+        <w:spacing w:before="0" w:after="0" w:line="240" w:lineRule="auto"/>
+      </w:pPr>
+      <w:r>
+        <w:rPr>
+          <w:rFonts w:ascii="Consolas" w:hAnsi="Consolas" w:eastAsia="Consolas" w:cs="Consolas"/>
+          <w:sz w:val="15"/>
+          <w:noProof/>
+        </w:rPr>
+        <w:t>ALT_TXT = 'PCA fitted once on all spectra' if PCA_PER_FOLD else 'PCA re-fitted in each training fold'</w:t>
+      </w:r>
+    </w:p>
+    <w:p>
+      <w:pPr>
+        <w:spacing w:before="0" w:after="0" w:line="240" w:lineRule="auto"/>
+      </w:pPr>
+      <w:r>
+        <w:rPr>
+          <w:rFonts w:ascii="Consolas" w:hAnsi="Consolas" w:eastAsia="Consolas" w:cs="Consolas"/>
+          <w:sz w:val="15"/>
+          <w:noProof/>
+        </w:rPr>
+        <w:t>report('\n6. FIGURE 5 - cross-validation (PCA-LDA: ' + MAIN_TXT + ')')</w:t>
       </w:r>
     </w:p>
     <w:p>
@@ -17215,20 +17280,20 @@
           <w:sz w:val="15"/>
           <w:noProof/>
         </w:rPr>
-        <w:t xml:space="preserve">    RES[w]['strict'] = (cv_pca_lda(X, y, folds, refit=True) == y).mean() * 100</w:t>
-      </w:r>
-    </w:p>
-    <w:p>
-      <w:pPr>
-        <w:spacing w:before="0" w:after="0" w:line="240" w:lineRule="auto"/>
-      </w:pPr>
-      <w:r>
-        <w:rPr>
-          <w:rFonts w:ascii="Consolas" w:hAnsi="Consolas" w:eastAsia="Consolas" w:cs="Consolas"/>
-          <w:sz w:val="15"/>
-          <w:noProof/>
-        </w:rPr>
-        <w:t xml:space="preserve">    for col, (model, pred) in enumerate([('PCA-LDA', cv_pca_lda(X, y, folds)),</w:t>
+        <w:t xml:space="preserve">    RES[w]['alt'] = (cv_pca_lda(X, y, folds, refit=not PCA_PER_FOLD) == y).mean() * 100</w:t>
+      </w:r>
+    </w:p>
+    <w:p>
+      <w:pPr>
+        <w:spacing w:before="0" w:after="0" w:line="240" w:lineRule="auto"/>
+      </w:pPr>
+      <w:r>
+        <w:rPr>
+          <w:rFonts w:ascii="Consolas" w:hAnsi="Consolas" w:eastAsia="Consolas" w:cs="Consolas"/>
+          <w:sz w:val="15"/>
+          <w:noProof/>
+        </w:rPr>
+        <w:t xml:space="preserve">    for col, (model, pred) in enumerate([('PCA-LDA', cv_pca_lda(X, y, folds, refit=PCA_PER_FOLD)),</w:t>
       </w:r>
     </w:p>
     <w:p>
@@ -17579,7 +17644,7 @@
           <w:sz w:val="15"/>
           <w:noProof/>
         </w:rPr>
-        <w:t xml:space="preserve">    report(f'  {PLAIN[w]} PCA-LDA, PCA re-fitted in each fold: {RES[w]["strict"]:.1f} %')</w:t>
+        <w:t xml:space="preserve">    report(f'  {PLAIN[w]} PCA-LDA, comparison with {ALT_TXT}: {RES[w]["alt"]:.1f} %')</w:t>
       </w:r>
     </w:p>
     <w:p>
@@ -17915,7 +17980,7 @@
           <w:sz w:val="15"/>
           <w:noProof/>
         </w:rPr>
-        <w:t xml:space="preserve">            accs['PCA-LDA'].append((cv_pca_lda(X, yp, fp, T=T_all) == yp).mean() * 100)</w:t>
+        <w:t xml:space="preserve">            accs['PCA-LDA'].append((cv_pca_lda(X, yp, fp, T=T_all, refit=PCA_PER_FOLD) == yp).mean() * 100)</w:t>
       </w:r>
     </w:p>
     <w:p>
@@ -19145,20 +19210,33 @@
           <w:sz w:val="15"/>
           <w:noProof/>
         </w:rPr>
-        <w:t xml:space="preserve">      f'  {N_COMP} components, exact SVD (svd_solver = "full"), mean-centred, all 240 spectra, '</w:t>
-      </w:r>
-    </w:p>
-    <w:p>
-      <w:pPr>
-        <w:spacing w:before="0" w:after="0" w:line="240" w:lineRule="auto"/>
-      </w:pPr>
-      <w:r>
-        <w:rPr>
-          <w:rFonts w:ascii="Consolas" w:hAnsi="Consolas" w:eastAsia="Consolas" w:cs="Consolas"/>
-          <w:sz w:val="15"/>
-          <w:noProof/>
-        </w:rPr>
-        <w:t xml:space="preserve">      f'labels not used. PC1 sign: loading positive at {PC1_REF["fingerprint"]} / '</w:t>
+        <w:t xml:space="preserve">      f'  {N_COMP} components, exact SVD (svd_solver = "full"), mean-centred, labels not used. '</w:t>
+      </w:r>
+    </w:p>
+    <w:p>
+      <w:pPr>
+        <w:spacing w:before="0" w:after="0" w:line="240" w:lineRule="auto"/>
+      </w:pPr>
+      <w:r>
+        <w:rPr>
+          <w:rFonts w:ascii="Consolas" w:hAnsi="Consolas" w:eastAsia="Consolas" w:cs="Consolas"/>
+          <w:sz w:val="15"/>
+          <w:noProof/>
+        </w:rPr>
+        <w:t xml:space="preserve">      f'Figure 3 a/c: all 240 spectra. PCA-LDA classification: ' + MAIN_TXT + '. '</w:t>
+      </w:r>
+    </w:p>
+    <w:p>
+      <w:pPr>
+        <w:spacing w:before="0" w:after="0" w:line="240" w:lineRule="auto"/>
+      </w:pPr>
+      <w:r>
+        <w:rPr>
+          <w:rFonts w:ascii="Consolas" w:hAnsi="Consolas" w:eastAsia="Consolas" w:cs="Consolas"/>
+          <w:sz w:val="15"/>
+          <w:noProof/>
+        </w:rPr>
+        <w:t xml:space="preserve">      f'PC1 sign: loading positive at {PC1_REF["fingerprint"]} / '</w:t>
       </w:r>
     </w:p>
     <w:p>
@@ -19353,7 +19431,7 @@
           <w:sz w:val="15"/>
           <w:noProof/>
         </w:rPr>
-        <w:t>md += ['  Stricter check: PCA re-fitted inside every training fold.',</w:t>
+        <w:t>md += ['  Comparison: PCA-LDA with ' + ALT_TXT + '.',</w:t>
       </w:r>
     </w:p>
     <w:p>
@@ -19691,7 +19769,7 @@
           <w:sz w:val="15"/>
           <w:noProof/>
         </w:rPr>
-        <w:t xml:space="preserve">    md.append(f'    PCA-LDA with PCA re-fitted per fold: {r["strict"]:.1f} %; '</w:t>
+        <w:t xml:space="preserve">    md.append(f'    PCA-LDA with {ALT_TXT} (comparison): {r["alt"]:.1f} %; '</w:t>
       </w:r>
     </w:p>
     <w:p>
@@ -20197,7 +20275,7 @@
           <w:sz w:val="15"/>
           <w:noProof/>
         </w:rPr>
-        <w:t xml:space="preserve">    txt += [f'PCA-LDA with PCA re-fitted per fold: {r["strict"]:.1f}%.', '']</w:t>
+        <w:t xml:space="preserve">    txt += [f'PCA-LDA (Fig 5, Table 1) uses {MAIN_TXT}; with {ALT_TXT}: {r["alt"]:.1f}%.', '']</w:t>
       </w:r>
     </w:p>
     <w:p>
@@ -20288,33 +20366,33 @@
           <w:sz w:val="15"/>
           <w:noProof/>
         </w:rPr>
-        <w:t xml:space="preserve">        '* Fig 3 b/d shows out-of-fold LDA scores with PCA re-fitted in each training fold (the stricter '</w:t>
-      </w:r>
-    </w:p>
-    <w:p>
-      <w:pPr>
-        <w:spacing w:before="0" w:after="0" w:line="240" w:lineRule="auto"/>
-      </w:pPr>
-      <w:r>
-        <w:rPr>
-          <w:rFonts w:ascii="Consolas" w:hAnsi="Consolas" w:eastAsia="Consolas" w:cs="Consolas"/>
-          <w:sz w:val="15"/>
-          <w:noProof/>
-        </w:rPr>
-        <w:t xml:space="preserve">        'check, Table S2); Fig 5 / Table 1 use PCA fitted once on all spectra (no labels), so their '</w:t>
-      </w:r>
-    </w:p>
-    <w:p>
-      <w:pPr>
-        <w:spacing w:before="0" w:after="0" w:line="240" w:lineRule="auto"/>
-      </w:pPr>
-      <w:r>
-        <w:rPr>
-          <w:rFonts w:ascii="Consolas" w:hAnsi="Consolas" w:eastAsia="Consolas" w:cs="Consolas"/>
-          <w:sz w:val="15"/>
-          <w:noProof/>
-        </w:rPr>
-        <w:t xml:space="preserve">        'error counts can differ by a few spectra.']</w:t>
+        <w:t xml:space="preserve">        '* Fig 3 b/d shows the out-of-fold LDA scores of the PCA-LDA model (PCA + LDA fitted on the '</w:t>
+      </w:r>
+    </w:p>
+    <w:p>
+      <w:pPr>
+        <w:spacing w:before="0" w:after="0" w:line="240" w:lineRule="auto"/>
+      </w:pPr>
+      <w:r>
+        <w:rPr>
+          <w:rFonts w:ascii="Consolas" w:hAnsi="Consolas" w:eastAsia="Consolas" w:cs="Consolas"/>
+          <w:sz w:val="15"/>
+          <w:noProof/>
+        </w:rPr>
+        <w:t xml:space="preserve">        'training folds); with PCA_PER_FOLD = True the spectra below 0 are exactly the errors in '</w:t>
+      </w:r>
+    </w:p>
+    <w:p>
+      <w:pPr>
+        <w:spacing w:before="0" w:after="0" w:line="240" w:lineRule="auto"/>
+      </w:pPr>
+      <w:r>
+        <w:rPr>
+          <w:rFonts w:ascii="Consolas" w:hAnsi="Consolas" w:eastAsia="Consolas" w:cs="Consolas"/>
+          <w:sz w:val="15"/>
+          <w:noProof/>
+        </w:rPr>
+        <w:t xml:space="preserve">        'Fig 5 / Table 1.']</w:t>
       </w:r>
     </w:p>
     <w:p>

</xml_diff>